<commit_message>
docs: add usage guide, interview checklist and effect correction
</commit_message>
<xml_diff>
--- a/outputs/reports/monthly_2026-09.docx
+++ b/outputs/reports/monthly_2026-09.docx
@@ -63,7 +63,7 @@
           <w:color w:val="333D4A"/>
           <w:sz w:val="20"/>
         </w:rPr>
-        <w:t>9月申请量环比回升26.2%（36,012 vs 28,537），但审批通过率降至22.9%（环比-6.5个百分点，稳健z值-7.11，触发高等级预警），放款金额仍增长32.1%至188,680.95，主要靠件均金额上升（23.38 vs 17.91）和期限拉长（15.97 vs 13.66个月）支撑，而非通过率改善。</w:t>
+        <w:t>9月申请量环比回升26.2%（28,537→36,012），但审批通过率降至22.9%（环比-6.5个百分点，稳健z值-7.11，高严重度），放款金额仍增长32.1%（142,868.64→188,680.95），说明规模增长由“件均与期限上行”驱动，而非审批能力提升；通过率下滑主要是渠道结构效应，而非各渠道风控标准普遍收紧。</w:t>
       </w:r>
     </w:p>
     <w:p>
@@ -91,12 +91,14 @@
           <w:color w:val="173B57"/>
           <w:sz w:val="20"/>
         </w:rPr>
-        <w:t>发现一：通过率下滑主要是结构效应，不是审批能力恶化。</w:t>
+        <w:t>发现一：通过率下滑以结构效应为主，不是全面收紧。</w:t>
       </w:r>
     </w:p>
     <w:p>
       <w:pPr>
+        <w:pStyle w:val="ListBullet"/>
         <w:spacing w:after="60" w:line="293" w:lineRule="auto"/>
+        <w:ind w:left="259" w:hanging="173"/>
       </w:pPr>
       <w:r>
         <w:rPr>
@@ -105,7 +107,23 @@
           <w:color w:val="333D4A"/>
           <w:sz w:val="20"/>
         </w:rPr>
-        <w:t>渠道分解显示，总通过率下降约6.5个百分点中，结构（mix）效应合计约-5.4个百分点，比率（rate）效应合计约-0.8个百分点。最大单一来源是 Country-wide 渠道权重从16.66%降至12.17%（结构效应 -2.75个百分点），叠加 Credit and cash offices 权重从60.26%升至65.06%（结构效应 -1.00个百分点）——后者通过率仅7.84%，属于低通过率渠道占比上升。真正的比率恶化集中在 AP+（Cash loan）渠道，通过率从39.09%降至23.08%（比率效应 -0.21个百分点）。结论：通过率下降主要是申请组合向低通过率渠道倾斜，不宜直接解读为风控标准收紧。</w:t>
+        <w:t>整体通过率从29.41%降至22.90%。分解显示：Credit and cash offices（申请占比从60.3%升至65.1%，通过率仅7.84%）贡献总效应-1.47个百分点，其中结构效应-1.00个百分点、比率效应-0.47个百分点；Country-wide（占比从16.7%降至12.2%）贡献-3.11个百分点，其中结构效应-2.75个百分点、比率效应-0.37个百分点。</w:t>
+      </w:r>
+    </w:p>
+    <w:p>
+      <w:pPr>
+        <w:pStyle w:val="ListBullet"/>
+        <w:spacing w:after="60" w:line="293" w:lineRule="auto"/>
+        <w:ind w:left="259" w:hanging="173"/>
+      </w:pPr>
+      <w:r>
+        <w:rPr>
+          <w:rFonts w:ascii="Microsoft YaHei" w:hAnsi="Microsoft YaHei" w:eastAsia="Microsoft YaHei"/>
+          <w:b w:val="0"/>
+          <w:color w:val="333D4A"/>
+          <w:sz w:val="20"/>
+        </w:rPr>
+        <w:t>结论：低通过率渠道（Credit and cash offices、Contact center 4.33%）申请占比上升，高通过率渠道（Country-wide 87.64%、Stone 88.12%、Regional/Local 87.44%）占比下降，是整体通过率下行的主因。各渠道自身通过率变化幅度有限（如Country-wide仅-3.0个百分点、Stone -4.1个百分点）。</w:t>
       </w:r>
     </w:p>
     <w:p>
@@ -119,12 +137,14 @@
           <w:color w:val="173B57"/>
           <w:sz w:val="20"/>
         </w:rPr>
-        <w:t>发现二：放款金额增长由件均和期限驱动，量的贡献有限。</w:t>
+        <w:t>发现二：放款金额增长来自件均与期限，而非通过件数。</w:t>
       </w:r>
     </w:p>
     <w:p>
       <w:pPr>
+        <w:pStyle w:val="ListBullet"/>
         <w:spacing w:after="60" w:line="293" w:lineRule="auto"/>
+        <w:ind w:left="259" w:hanging="173"/>
       </w:pPr>
       <w:r>
         <w:rPr>
@@ -133,7 +153,23 @@
           <w:color w:val="333D4A"/>
           <w:sz w:val="20"/>
         </w:rPr>
-        <w:t>9月放款8,070笔，环比仅增1.2%（7,975→8,070）；但放款金额从142,868.64增至188,680.95（+32.1%），件均从17.91升至23.38，平均期限从13.66升至15.97个月。同时使用率从95.01%升至97.88%，未使用额度从419降至175。这说明本月规模增长是"单笔更大、期限更长"的结构变化，需关注期限拉长对后续久期风险和利息收入的雙向影响。</w:t>
+        <w:t>通过件数从8,394降至8,245（-1.8%），但放款金额从142,868.64增至188,680.95（+32.1%）；件均从17.91升至23.38，平均期限从13.66个月升至15.97个月，平均利率从11.70%升至12.86%。</w:t>
+      </w:r>
+    </w:p>
+    <w:p>
+      <w:pPr>
+        <w:pStyle w:val="ListBullet"/>
+        <w:spacing w:after="60" w:line="293" w:lineRule="auto"/>
+        <w:ind w:left="259" w:hanging="173"/>
+      </w:pPr>
+      <w:r>
+        <w:rPr>
+          <w:rFonts w:ascii="Microsoft YaHei" w:hAnsi="Microsoft YaHei" w:eastAsia="Microsoft YaHei"/>
+          <w:b w:val="0"/>
+          <w:color w:val="333D4A"/>
+          <w:sz w:val="20"/>
+        </w:rPr>
+        <w:t>结构上，Credit and cash offices件均60.26、Contact center件均66.81，远高于Country-wide的9.17，其申请占比上升同时推高了金额与件均。</w:t>
       </w:r>
     </w:p>
     <w:p>
@@ -147,12 +183,14 @@
           <w:color w:val="173B57"/>
           <w:sz w:val="20"/>
         </w:rPr>
-        <w:t>发现三：资产质量表观稳定，但新 cohort 样本尚不足以判断。</w:t>
+        <w:t>发现三：额度使用率创新高，拒绝量显著上升。</w:t>
       </w:r>
     </w:p>
     <w:p>
       <w:pPr>
+        <w:pStyle w:val="ListBullet"/>
         <w:spacing w:after="60" w:line="293" w:lineRule="auto"/>
+        <w:ind w:left="259" w:hanging="173"/>
       </w:pPr>
       <w:r>
         <w:rPr>
@@ -161,7 +199,23 @@
           <w:color w:val="333D4A"/>
           <w:sz w:val="20"/>
         </w:rPr>
-        <w:t>2026-09 cohort 在 mob 0 的 dpd30/60/90 均为0，但放款笔数仅5,375，且账龄为0，不能作为质量结论。可参考的成熟 cohort：2025-10 在 mob 11 的累计 dpd30 为0.60%、累计 dpd90 为0.03%；2025-11 在 mob 10 的累计 dpd30 为0.64%、累计 dpd90 为0.06%。区域维度上，region_rating 3 的 bad_rate 为11.10%，显著高于 rating 1 的4.82%和 rating 2 的7.89%，但 rating 3 客户数48,330、exposure 2,772,127.68，占比有限。</w:t>
+        <w:t>使用率从95.01%升至97.88%，未使用额度从419降至175；拒绝量从4,292升至6,827（+59.1%），而通过量基本持平。</w:t>
+      </w:r>
+    </w:p>
+    <w:p>
+      <w:pPr>
+        <w:pStyle w:val="ListBullet"/>
+        <w:spacing w:after="60" w:line="293" w:lineRule="auto"/>
+        <w:ind w:left="259" w:hanging="173"/>
+      </w:pPr>
+      <w:r>
+        <w:rPr>
+          <w:rFonts w:ascii="Microsoft YaHei" w:hAnsi="Microsoft YaHei" w:eastAsia="Microsoft YaHei"/>
+          <w:b w:val="0"/>
+          <w:color w:val="333D4A"/>
+          <w:sz w:val="20"/>
+        </w:rPr>
+        <w:t>资产质量端，2026-09 cohort mob0的dpd30率为0.0%，2026-08 cohort mob0为0.17%、mob1为0.0%；早期表现未见恶化，但新 cohort 观察期过短，不足以判断。</w:t>
       </w:r>
     </w:p>
     <w:p>
@@ -189,7 +243,7 @@
           <w:color w:val="173B57"/>
           <w:sz w:val="20"/>
         </w:rPr>
-        <w:t>风险一：通过率预警与结构漂移的叠加风险。</w:t>
+        <w:t>风险一：结构漂移可能掩盖真实风险敞口。</w:t>
       </w:r>
     </w:p>
     <w:p>
@@ -203,7 +257,7 @@
           <w:color w:val="333D4A"/>
           <w:sz w:val="20"/>
         </w:rPr>
-        <w:t>审批通过率稳健z值-7.11属高等级异常。虽然分解显示主要为结构效应，但 Credit and cash offices 渠道申请量环比大增（17,197→23,430），该渠道通过率仅7.84%，若这一渠道占比继续上升，总通过率将被持续稀释，且该渠道件均60.26远高于全盘23.38，意味着"高件均、低通过"的组合在放大单笔风险敞口。需警惕申请端流量结构变化是否由渠道激励或营销策略驱动。</w:t>
+        <w:t>低通过率、高件均渠道占比上升，使放款金额和件均同步抬升。若该结构持续，组合的客户画像与风险分布将发生变化，而当前 vintage 数据中2026-06之后 cohort 的 mob 均≤3，累计dpd30最高仅0.14%，样本期过短，无法验证新结构的长期表现。相关性上金额增长与结构变化同时发生，不能据此认定结构变化是安全的。</w:t>
       </w:r>
     </w:p>
     <w:p>
@@ -217,7 +271,7 @@
           <w:color w:val="173B57"/>
           <w:sz w:val="20"/>
         </w:rPr>
-        <w:t>风险二：期限拉长与利率上行的组合，对后续逾期表现的滞后影响不可忽视。</w:t>
+        <w:t>风险二：通过率异常已触发高严重度预警，需排除口径与流程因素。</w:t>
       </w:r>
     </w:p>
     <w:p>
@@ -231,7 +285,7 @@
           <w:color w:val="333D4A"/>
           <w:sz w:val="20"/>
         </w:rPr>
-        <w:t>平均期限从13.66升至15.97个月，平均利率从11.70%升至12.86%。期限拉长会延后风险暴露时点，当前 vintage 数据（2026-06至2026-09 cohort 账龄均≤3）不足以验证新客群质量。同时 region_rating 3 的 bad_rate 11.10%提示低评级区域风险偏高，若新增放款向此类区域倾斜，将在6-12个月后体现。此为相关性观察，尚不能判定因果。</w:t>
+        <w:t>审批通过率稳健z值-7.11属统计异常。需区分是渠道流量结构变化、审批策略调整，还是申请质量下降或系统/口径问题。当前数据无法区分这三者，不宜直接归因为风控收紧或客群恶化。</w:t>
       </w:r>
     </w:p>
     <w:p>
@@ -255,11 +309,11 @@
       <w:r>
         <w:rPr>
           <w:rFonts w:ascii="Microsoft YaHei" w:hAnsi="Microsoft YaHei" w:eastAsia="Microsoft YaHei"/>
-          <w:b/>
-          <w:color w:val="173B57"/>
+          <w:b w:val="0"/>
+          <w:color w:val="333D4A"/>
           <w:sz w:val="20"/>
         </w:rPr>
-        <w:t>建议一：拆解 Credit and cash offices 渠道申请量激增的驱动因素。</w:t>
+        <w:t>| 建议 | 责任部门 | 验证指标 |</w:t>
       </w:r>
     </w:p>
     <w:p>
@@ -273,21 +327,7 @@
           <w:color w:val="333D4A"/>
           <w:sz w:val="20"/>
         </w:rPr>
-        <w:t>责任部门：渠道管理部 + 风险管理部。验证指标：下月该渠道申请量占比是否回落至60%以下、该渠道通过率是否稳定在7%-9%区间、该渠道件均是否维持在60左右。若申请量继续上升而通过率不变，需评估渠道准入策略。</w:t>
-      </w:r>
-    </w:p>
-    <w:p>
-      <w:pPr>
-        <w:spacing w:after="60" w:line="293" w:lineRule="auto"/>
-      </w:pPr>
-      <w:r>
-        <w:rPr>
-          <w:rFonts w:ascii="Microsoft YaHei" w:hAnsi="Microsoft YaHei" w:eastAsia="Microsoft YaHei"/>
-          <w:b/>
-          <w:color w:val="173B57"/>
-          <w:sz w:val="20"/>
-        </w:rPr>
-        <w:t>建议二：对 AP+（Cash loan）渠道通过率骤降（39.09%→23.08%）做专项归因。</w:t>
+        <w:t>|---|---|---|</w:t>
       </w:r>
     </w:p>
     <w:p>
@@ -301,21 +341,7 @@
           <w:color w:val="333D4A"/>
           <w:sz w:val="20"/>
         </w:rPr>
-        <w:t>责任部门：风险管理部（审批策略组）。验证指标：该渠道下月通过率是否回升至30%以上、拒绝原因分布（如评分不足/多头/资料不全）的占比变化、该渠道申请量（468）是否持续。这是本月唯一比率效应为负且幅度明显的渠道，需区分是客群变化还是策略调整。</w:t>
-      </w:r>
-    </w:p>
-    <w:p>
-      <w:pPr>
-        <w:spacing w:after="60" w:line="293" w:lineRule="auto"/>
-      </w:pPr>
-      <w:r>
-        <w:rPr>
-          <w:rFonts w:ascii="Microsoft YaHei" w:hAnsi="Microsoft YaHei" w:eastAsia="Microsoft YaHei"/>
-          <w:b/>
-          <w:color w:val="173B57"/>
-          <w:sz w:val="20"/>
-        </w:rPr>
-        <w:t>建议三：建立期限拉长后的早期预警监控，重点跟踪2026-07至2026-09 cohort。</w:t>
+        <w:t>| 1. 对Credit and cash offices与Contact center两条低通过率、高件均渠道做专项归因：拆分申请质量、审批规则命中与人工复核环节，确认通过率7.84%/4.33%是否为目标水平 | 风险管理部、渠道管理部 | 两渠道月度通过率、拒绝原因分布、复核推翻率；下月整体通过率是否回升至25%以上 |</w:t>
       </w:r>
     </w:p>
     <w:p>
@@ -329,7 +355,21 @@
           <w:color w:val="333D4A"/>
           <w:sz w:val="20"/>
         </w:rPr>
-        <w:t>责任部门：资产监控部 + 数据管理部。验证指标：2026-07 cohort 在 mob 3 的累计 dpd30（当前 mob 2 为0.06%）、2026-08 cohort 在 mob 2 的累计 dpd30（当前 mob 1 为0.07%）、以及 region_rating 3 新增放款占比。建议按月输出 cohort 迁移表，在 mob 3-6 设置 dpd30 阈值告警。</w:t>
+        <w:t>| 2. 建立渠道结构监控看板，按月输出mix/rate效应分解，设定结构效应阈值（如单渠道占比变动超3个百分点触发复核），避免结构漂移在无预警下改变组合风险 | 风险管理部、数据分析部 | 月度结构效应绝对值、高通过率渠道（Country-wide/Stone/Regional）合计申请占比 |</w:t>
+      </w:r>
+    </w:p>
+    <w:p>
+      <w:pPr>
+        <w:spacing w:after="60" w:line="293" w:lineRule="auto"/>
+      </w:pPr>
+      <w:r>
+        <w:rPr>
+          <w:rFonts w:ascii="Microsoft YaHei" w:hAnsi="Microsoft YaHei" w:eastAsia="Microsoft YaHei"/>
+          <w:b w:val="0"/>
+          <w:color w:val="333D4A"/>
+          <w:sz w:val="20"/>
+        </w:rPr>
+        <w:t>| 3. 对2026-06以来新 cohort 加密早期监控（mob1–3的dpd30），并与2025年同期 cohort 同 mob 对比，验证件均与期限上升是否带来早期风险抬升 | 风险管理部、资产保全部 | 新 cohort mob3累计dpd30率、同 mob 同比差异；件均&gt;50的放款 cohort 单独跟踪 |</w:t>
       </w:r>
     </w:p>
     <w:p>
@@ -352,7 +392,7 @@
           <w:color w:val="333D4A"/>
           <w:sz w:val="20"/>
         </w:rPr>
-        <w:t xml:space="preserve"> 本月 vintage 最新 cohort（2026-09）账龄为0，2026-06至2026-09 cohort 账龄均≤3个月，无法支撑新客群质量结论；区域 bad_rate 为存量口径，与本月新增放款的对应关系需进一步匹配；通过率分解中的 mix/rate 效应基于渠道维度，产品维度（如 Cash loans XNA 通过率为0、申请19,435笔）的结构影响未纳入分解，可能低估结构效应。</w:t>
+        <w:t xml:space="preserve"> 本次分析仅基于给定月度汇总与 vintage 表，未包含审批规则变更记录、渠道流量来源明细及宏观/客群变量；vintage 中2026-06之后 cohort 观察期不足，任何关于新结构资产质量的判断均为待验证假设，不构成因果结论。</w:t>
       </w:r>
     </w:p>
     <w:p>

</xml_diff>